<commit_message>
Added Yes.docx to .gitignore and deleted the file  from the repository. This file should not be  tracked in version control.
</commit_message>
<xml_diff>
--- a/Yes.docx
+++ b/Yes.docx
@@ -20,7 +20,7 @@
     <w:p>
       <w:r>
         <w:pict w14:anchorId="29EB2410">
-          <v:rect id="_x0000_i1055" style="width:0;height:1.5pt" o:hralign="center" o:hrstd="t" o:hr="t" fillcolor="#a0a0a0" stroked="f"/>
+          <v:rect id="_x0000_i1025" style="width:0;height:1.5pt" o:hralign="center" o:hrstd="t" o:hr="t" fillcolor="#a0a0a0" stroked="f"/>
         </w:pict>
       </w:r>
     </w:p>
@@ -286,7 +286,7 @@
     <w:p>
       <w:r>
         <w:pict w14:anchorId="3CD330E3">
-          <v:rect id="_x0000_i1056" style="width:0;height:1.5pt" o:hralign="center" o:hrstd="t" o:hr="t" fillcolor="#a0a0a0" stroked="f"/>
+          <v:rect id="_x0000_i1026" style="width:0;height:1.5pt" o:hralign="center" o:hrstd="t" o:hr="t" fillcolor="#a0a0a0" stroked="f"/>
         </w:pict>
       </w:r>
     </w:p>
@@ -422,7 +422,7 @@
     <w:p>
       <w:r>
         <w:pict w14:anchorId="0D073B5A">
-          <v:rect id="_x0000_i1057" style="width:0;height:1.5pt" o:hralign="center" o:hrstd="t" o:hr="t" fillcolor="#a0a0a0" stroked="f"/>
+          <v:rect id="_x0000_i1027" style="width:0;height:1.5pt" o:hralign="center" o:hrstd="t" o:hr="t" fillcolor="#a0a0a0" stroked="f"/>
         </w:pict>
       </w:r>
     </w:p>
@@ -508,7 +508,7 @@
     <w:p>
       <w:r>
         <w:pict w14:anchorId="697C98BA">
-          <v:rect id="_x0000_i1058" style="width:0;height:1.5pt" o:hralign="center" o:hrstd="t" o:hr="t" fillcolor="#a0a0a0" stroked="f"/>
+          <v:rect id="_x0000_i1028" style="width:0;height:1.5pt" o:hralign="center" o:hrstd="t" o:hr="t" fillcolor="#a0a0a0" stroked="f"/>
         </w:pict>
       </w:r>
     </w:p>
@@ -601,7 +601,7 @@
     <w:p>
       <w:r>
         <w:pict w14:anchorId="6BFBF7C7">
-          <v:rect id="_x0000_i1059" style="width:0;height:1.5pt" o:hralign="center" o:hrstd="t" o:hr="t" fillcolor="#a0a0a0" stroked="f"/>
+          <v:rect id="_x0000_i1029" style="width:0;height:1.5pt" o:hralign="center" o:hrstd="t" o:hr="t" fillcolor="#a0a0a0" stroked="f"/>
         </w:pict>
       </w:r>
     </w:p>
@@ -1693,6 +1693,7 @@
   <w:style w:type="character" w:default="1" w:styleId="DefaultParagraphFont">
     <w:name w:val="Default Paragraph Font"/>
     <w:uiPriority w:val="1"/>
+    <w:semiHidden/>
     <w:unhideWhenUsed/>
   </w:style>
   <w:style w:type="table" w:default="1" w:styleId="TableNormal">

</xml_diff>